<commit_message>
docs: rename Nectar to Нектар in coursework documents, fix onboarding description
</commit_message>
<xml_diff>
--- a/docs/coursework/Пояснительная_записка.docx
+++ b/docs/coursework/Пояснительная_записка.docx
@@ -309,7 +309,7 @@
           <w:sz w:val="28"/>
           <w:szCs w:val="28"/>
         </w:rPr>
-        <w:t xml:space="preserve">«Разработка мобильного приложения и веб-панели управления для интернет-магазина продуктов «Nectar»»</w:t>
+        <w:t xml:space="preserve">«Разработка мобильного приложения и веб-панели управления для интернет-магазина продуктов «Нектар»»</w:t>
       </w:r>
     </w:p>
     <w:p>
@@ -2035,7 +2035,7 @@
         <w:pStyle w:val="a4"/>
       </w:pPr>
       <w:r>
-        <w:t xml:space="preserve">Цель данной курсовой работы – разработать программное решение для интернет-магазина продуктов «Nectar». В самом приложении покупатели смогут просматривать каталог, добавлять товары в корзину, оформлять заказы и следить за их выполнением, а курьеры – брать заказы в работу и подтверждать доставку.</w:t>
+        <w:t xml:space="preserve">Цель данной курсовой работы – разработать программное решение для интернет-магазина продуктов «Нектар». В самом приложении покупатели смогут просматривать каталог, добавлять товары в корзину, оформлять заказы и следить за их выполнением, а курьеры – брать заказы в работу и подтверждать доставку.</w:t>
       </w:r>
     </w:p>
     <w:p>
@@ -2051,7 +2051,7 @@
         <w:pStyle w:val="a4"/>
       </w:pPr>
       <w:r>
-        <w:t xml:space="preserve">В конечном итоге должна получиться полноценная система, которая свяжет покупателей, курьеров и сотрудников магазина. Внедрение такого решения поможет «Nectar» повысить лояльность аудитории за счет современного сервиса, а также навести порядок во внутренних процессах учета остатков и продаж.</w:t>
+        <w:t xml:space="preserve">В конечном итоге должна получиться полноценная система, которая свяжет покупателей, курьеров и сотрудников магазина. Внедрение такого решения поможет «Нектар» повысить лояльность аудитории за счет современного сервиса, а также навести порядок во внутренних процессах учета остатков и продаж.</w:t>
       </w:r>
     </w:p>
     <w:p>
@@ -2090,7 +2090,7 @@
         <w:pStyle w:val="a4"/>
       </w:pPr>
       <w:r>
-        <w:t xml:space="preserve">Основной целью разработки является автоматизация процессов розничной торговли продуктами питания, учета товарных позиций и информационного сопровождения клиентов интернет-магазина «Nectar». Внедрение разрабатываемого программного обеспечения должно обеспечить удобное взаимодействие между магазином, покупателем и курьером посредством мобильного устройства, а также предоставить сотрудникам магазина инструменты для эффективного управления каталогом, остатками, заказами и пользователями через веб-интерфейс.</w:t>
+        <w:t xml:space="preserve">Основной целью разработки является автоматизация процессов розничной торговли продуктами питания, учета товарных позиций и информационного сопровождения клиентов интернет-магазина «Нектар». Внедрение разрабатываемого программного обеспечения должно обеспечить удобное взаимодействие между магазином, покупателем и курьером посредством мобильного устройства, а также предоставить сотрудникам магазина инструменты для эффективного управления каталогом, остатками, заказами и пользователями через веб-интерфейс.</w:t>
       </w:r>
     </w:p>
     <w:p>
@@ -3648,7 +3648,7 @@
         <w:pStyle w:val="a4"/>
       </w:pPr>
       <w:r>
-        <w:t xml:space="preserve">Программное решение «Nectar» должно иметь следующие функциональные возможности:</w:t>
+        <w:t xml:space="preserve">Программное решение «Нектар» должно иметь следующие функциональные возможности:</w:t>
       </w:r>
     </w:p>
     <w:p>
@@ -10123,7 +10123,7 @@
         <w:pStyle w:val="a4"/>
       </w:pPr>
       <w:r>
-        <w:t xml:space="preserve">Согласно схеме на рисунке 15, взаимодействие пользователя с мобильным приложением начинается с «Экрана загрузки». При первом запуске пользователь направляется на «Экран приветствия», после чего переходит на «Экран входа»; при повторном запуске экран приветствия пропускается. С экрана входа доступны экраны регистрации и восстановления пароля. После успешного входа определяется роль: покупатель попадает на основной экран с нижней навигацией, курьер – на экран «Доставка», администратор и менеджер видят сообщение о необходимости использовать веб-панель.</w:t>
+        <w:t xml:space="preserve">Согласно схеме на рисунке 15, взаимодействие пользователя с мобильным приложением начинается с «Экрана загрузки». Если сохраненного сеанса нет, пользователь направляется на «Экран приветствия», после чего переходит на «Экран входа»; если сеанс сохранен, экран приветствия и вход пропускаются. С экрана входа доступны экраны регистрации и восстановления пароля. После успешного входа определяется роль: покупатель попадает на основной экран с нижней навигацией, курьер – на экран «Доставка», администратор и менеджер видят сообщение о необходимости использовать веб-панель.</w:t>
       </w:r>
     </w:p>
     <w:p>
@@ -10145,7 +10145,7 @@
       <w:r>
         <w:drawing>
           <wp:inline xmlns:a="http://schemas.openxmlformats.org/drawingml/2006/main" xmlns:pic="http://schemas.openxmlformats.org/drawingml/2006/picture">
-            <wp:extent cx="9000000" cy="1459262"/>
+            <wp:extent cx="9000000" cy="1628959"/>
             <wp:docPr id="15" name="Picture 15"/>
             <wp:cNvGraphicFramePr>
               <a:graphicFrameLocks noChangeAspect="1"/>
@@ -10166,7 +10166,7 @@
                   <pic:spPr>
                     <a:xfrm>
                       <a:off x="0" y="0"/>
-                      <a:ext cx="9000000" cy="1459262"/>
+                      <a:ext cx="9000000" cy="1628959"/>
                     </a:xfrm>
                     <a:prstGeom prst="rect"/>
                   </pic:spPr>
@@ -10542,7 +10542,7 @@
         <w:pStyle w:val="a4"/>
       </w:pPr>
       <w:r>
-        <w:t xml:space="preserve">В результате выполнения поставленной задачи было разработано требуемое программное решение, которое представляет собой комплекс «Интернет-магазин продуктов «Nectar», состоящий из мобильного приложения и веб-панели управления на платформе Firebase.</w:t>
+        <w:t xml:space="preserve">В результате выполнения поставленной задачи было разработано требуемое программное решение, которое представляет собой комплекс «Интернет-магазин продуктов «Нектар», состоящий из мобильного приложения и веб-панели управления на платформе Firebase.</w:t>
       </w:r>
     </w:p>
     <w:p>
@@ -11658,7 +11658,7 @@
         <w:pStyle w:val="a4"/>
       </w:pPr>
       <w:r>
-        <w:t xml:space="preserve">Разработанный комплекс «Интернет-магазин продуктов «Nectar» состоит из мобильного приложения и веб-панели, работающих с облачной платформой Firebase. Мобильное приложение может запускаться на устройствах с операционными системами Android (версии 8.0 и выше) и iOS (версии 15.0 и выше). Основным критерием для запуска является наличие постоянного подключения к сети Интернет.</w:t>
+        <w:t xml:space="preserve">Разработанный комплекс «Интернет-магазин продуктов «Нектар» состоит из мобильного приложения и веб-панели, работающих с облачной платформой Firebase. Мобильное приложение может запускаться на устройствах с операционными системами Android (версии 8.0 и выше) и iOS (версии 15.0 и выше). Основным критерием для запуска является наличие постоянного подключения к сети Интернет.</w:t>
       </w:r>
     </w:p>
     <w:p>
@@ -11705,7 +11705,7 @@
         <w:pStyle w:val="a4"/>
       </w:pPr>
       <w:r>
-        <w:t xml:space="preserve">За время выполнения курсового проекта был разработан программный комплекс «Интернет-магазин продуктов «Nectar».</w:t>
+        <w:t xml:space="preserve">За время выполнения курсового проекта был разработан программный комплекс «Интернет-магазин продуктов «Нектар».</w:t>
       </w:r>
     </w:p>
     <w:p>
@@ -11785,7 +11785,7 @@
         <w:pStyle w:val="a4"/>
       </w:pPr>
       <w:r>
-        <w:t xml:space="preserve">Программный комплекс «Интернет-магазин продуктов «Nectar» поможет организации, желающей продавать продукты питания через Интернет, расширить свою клиентскую базу и увеличить прибыль за счёт:</w:t>
+        <w:t xml:space="preserve">Программный комплекс «Интернет-магазин продуктов «Нектар» поможет организации, желающей продавать продукты питания через Интернет, расширить свою клиентскую базу и увеличить прибыль за счёт:</w:t>
       </w:r>
     </w:p>
     <w:p>

</xml_diff>